<commit_message>
Podcast: ampliar la propuesta de recordatorios por WhatsApp en el bloque de dengue
Co-Authored-By: Claude Opus 5.5 <noreply@anthropic.com>
Claude-Session: https://claude.ai/code/session_01XuLJcNgUM3tZLL1ekwQRQZ
</commit_message>
<xml_diff>
--- a/Actividades/Podcast_Mirada_sobre_la_prevencion_guion.docx
+++ b/Actividades/Podcast_Mirada_sobre_la_prevencion_guion.docx
@@ -1190,7 +1190,7 @@
           <w:sz w:val="22"/>
           <w:szCs w:val="22"/>
         </w:rPr>
-        <w:t xml:space="preserve">06:33 minutos.</w:t>
+        <w:t xml:space="preserve">07:04 minutos.</w:t>
       </w:r>
     </w:p>
     <w:p>
@@ -2285,7 +2285,7 @@
                 <w:sz w:val="17"/>
                 <w:szCs w:val="17"/>
               </w:rPr>
-              <w:t xml:space="preserve">02:13 - 02:43</w:t>
+              <w:t xml:space="preserve">02:13 - 03:14</w:t>
             </w:r>
           </w:p>
         </w:tc>
@@ -2353,7 +2353,7 @@
                 <w:sz w:val="17"/>
                 <w:szCs w:val="17"/>
               </w:rPr>
-              <w:t xml:space="preserve">El impacto se nota: entre enero y agosto de 2026 los casos de dengue en la ciudad bajaron cerca de un quince por ciento frente al año anterior. Como mejora, propongo que la Liga trabaje todo el año y no solo en temporada de brote, que se apoye en los líderes de las juntas de acción comunal y que envíe recordatorios por WhatsApp para lavar los tanques, como recomienda la OMS con la comunicación digital dirigida.</w:t>
+              <w:t xml:space="preserve">El impacto se nota: entre enero y agosto de 2026 los casos de dengue en la ciudad bajaron cerca de un quince por ciento frente al año anterior. Como mejora, propongo que la Liga trabaje todo el año y no solo en temporada de brote, que se apoye en los líderes de las juntas de acción comunal y que aproveche WhatsApp, la herramienta que todos tenemos en el celular. Durante la visita, la Liga puede invitar a cada familia a inscribirse en un grupo de su barrio; desde allí, cada sábado llegaría un mensaje corto, con imagen o audio, que recuerde el “día del tanque limpio”. El mismo canal serviría para avisar de las jornadas de fumigación y para que los vecinos reporten criaderos con una foto. La OMS recomienda este tipo de comunicación digital dirigida porque los mensajes breves, frecuentes y adaptados a cada comunidad ayudan a mantener las conductas saludables.</w:t>
             </w:r>
           </w:p>
         </w:tc>
@@ -2394,7 +2394,7 @@
                 <w:sz w:val="17"/>
                 <w:szCs w:val="17"/>
               </w:rPr>
-              <w:t xml:space="preserve">02:43 - 02:45</w:t>
+              <w:t xml:space="preserve">03:14 - 03:16</w:t>
             </w:r>
           </w:p>
         </w:tc>
@@ -2503,7 +2503,7 @@
                 <w:sz w:val="17"/>
                 <w:szCs w:val="17"/>
               </w:rPr>
-              <w:t xml:space="preserve">02:45 - 03:44</w:t>
+              <w:t xml:space="preserve">03:16 - 04:15</w:t>
             </w:r>
           </w:p>
         </w:tc>
@@ -2612,7 +2612,7 @@
                 <w:sz w:val="17"/>
                 <w:szCs w:val="17"/>
               </w:rPr>
-              <w:t xml:space="preserve">03:44 - 03:46</w:t>
+              <w:t xml:space="preserve">04:15 - 04:17</w:t>
             </w:r>
           </w:p>
         </w:tc>
@@ -2721,7 +2721,7 @@
                 <w:sz w:val="17"/>
                 <w:szCs w:val="17"/>
               </w:rPr>
-              <w:t xml:space="preserve">03:46 - 04:28</w:t>
+              <w:t xml:space="preserve">04:17 - 04:59</w:t>
             </w:r>
           </w:p>
         </w:tc>
@@ -2830,7 +2830,7 @@
                 <w:sz w:val="17"/>
                 <w:szCs w:val="17"/>
               </w:rPr>
-              <w:t xml:space="preserve">04:28 - 04:36</w:t>
+              <w:t xml:space="preserve">04:59 - 05:07</w:t>
             </w:r>
           </w:p>
         </w:tc>
@@ -2939,7 +2939,7 @@
                 <w:sz w:val="17"/>
                 <w:szCs w:val="17"/>
               </w:rPr>
-              <w:t xml:space="preserve">04:36 - 04:54</w:t>
+              <w:t xml:space="preserve">05:07 - 05:25</w:t>
             </w:r>
           </w:p>
         </w:tc>
@@ -3048,7 +3048,7 @@
                 <w:sz w:val="17"/>
                 <w:szCs w:val="17"/>
               </w:rPr>
-              <w:t xml:space="preserve">04:54 - 04:56</w:t>
+              <w:t xml:space="preserve">05:25 - 05:27</w:t>
             </w:r>
           </w:p>
         </w:tc>
@@ -3157,7 +3157,7 @@
                 <w:sz w:val="17"/>
                 <w:szCs w:val="17"/>
               </w:rPr>
-              <w:t xml:space="preserve">04:56 - 05:53</w:t>
+              <w:t xml:space="preserve">05:27 - 06:23</w:t>
             </w:r>
           </w:p>
         </w:tc>
@@ -3266,7 +3266,7 @@
                 <w:sz w:val="17"/>
                 <w:szCs w:val="17"/>
               </w:rPr>
-              <w:t xml:space="preserve">05:53 - 06:08</w:t>
+              <w:t xml:space="preserve">06:23 - 06:38</w:t>
             </w:r>
           </w:p>
         </w:tc>
@@ -3375,7 +3375,7 @@
                 <w:sz w:val="17"/>
                 <w:szCs w:val="17"/>
               </w:rPr>
-              <w:t xml:space="preserve">06:08</w:t>
+              <w:t xml:space="preserve">06:38</w:t>
             </w:r>
           </w:p>
         </w:tc>
@@ -3484,7 +3484,7 @@
                 <w:sz w:val="17"/>
                 <w:szCs w:val="17"/>
               </w:rPr>
-              <w:t xml:space="preserve">06:08 - 06:25</w:t>
+              <w:t xml:space="preserve">06:38 - 06:56</w:t>
             </w:r>
           </w:p>
         </w:tc>
@@ -3593,7 +3593,7 @@
                 <w:sz w:val="17"/>
                 <w:szCs w:val="17"/>
               </w:rPr>
-              <w:t xml:space="preserve">06:25 - 06:33</w:t>
+              <w:t xml:space="preserve">06:56 - 07:04</w:t>
             </w:r>
           </w:p>
         </w:tc>

</xml_diff>

<commit_message>
Podcast: mejorar la redacción del bloque Octubre Rosa
Co-Authored-By: Claude Opus 5.5 <noreply@anthropic.com>
Claude-Session: https://claude.ai/code/session_01XuLJcNgUM3tZLL1ekwQRQZ
</commit_message>
<xml_diff>
--- a/Actividades/Podcast_Mirada_sobre_la_prevencion_guion.docx
+++ b/Actividades/Podcast_Mirada_sobre_la_prevencion_guion.docx
@@ -1190,7 +1190,7 @@
           <w:sz w:val="22"/>
           <w:szCs w:val="22"/>
         </w:rPr>
-        <w:t xml:space="preserve">07:04 minutos.</w:t>
+        <w:t xml:space="preserve">07:21 minutos.</w:t>
       </w:r>
     </w:p>
     <w:p>
@@ -2721,7 +2721,7 @@
                 <w:sz w:val="17"/>
                 <w:szCs w:val="17"/>
               </w:rPr>
-              <w:t xml:space="preserve">04:17 - 04:59</w:t>
+              <w:t xml:space="preserve">04:17 - 05:15</w:t>
             </w:r>
           </w:p>
         </w:tc>
@@ -2789,7 +2789,7 @@
                 <w:sz w:val="17"/>
                 <w:szCs w:val="17"/>
               </w:rPr>
-              <w:t xml:space="preserve">Y como estamos en octubre, mes de sensibilización sobre el cáncer de mama, observé jornadas del Octubre Rosa organizadas por IPS y EPS de la ciudad, con educación sobre el autoexamen, el examen clínico y la mamografía. La Ley 1384 de 2010 establece la atención integral del cáncer, y la Resolución 3280 de 2018 define la detección temprana: examen clínico de la mama desde los 40 años y mamografía cada dos años para las mujeres de 50 a 69. La metodología combina charlas, entrega de material, asignación de citas en el mismo lugar y remisión a la ruta de atención si se encuentra una alteración.</w:t>
+              <w:t xml:space="preserve">La tercera actividad tiene color rosa. Octubre es el mes de sensibilización sobre el cáncer de mama, y en Barranca observé jornadas organizadas por IPS y EPS donde se enseña a las mujeres a conocer su cuerpo con el autoexamen y se les explica la importancia del examen clínico y la mamografía. Estas acciones tienen respaldo legal: la Ley 1384 de 2010 garantiza la atención integral del cáncer, y la Resolución 3280 de 2018 indica que desde los cuarenta años las mujeres deben tener un examen clínico de la mama, y que entre los cincuenta y los sesenta y nueve años deben hacerse una mamografía cada dos años. La metodología es sencilla pero efectiva: primero una charla, luego la entrega de material educativo, después la asignación de la cita en el mismo lugar y, si se encuentra alguna alteración, la remisión inmediata a la ruta de atención.</w:t>
             </w:r>
           </w:p>
         </w:tc>
@@ -2830,7 +2830,7 @@
                 <w:sz w:val="17"/>
                 <w:szCs w:val="17"/>
               </w:rPr>
-              <w:t xml:space="preserve">04:59 - 05:07</w:t>
+              <w:t xml:space="preserve">05:15 - 05:23</w:t>
             </w:r>
           </w:p>
         </w:tc>
@@ -2939,7 +2939,7 @@
                 <w:sz w:val="17"/>
                 <w:szCs w:val="17"/>
               </w:rPr>
-              <w:t xml:space="preserve">05:07 - 05:25</w:t>
+              <w:t xml:space="preserve">05:23 - 05:41</w:t>
             </w:r>
           </w:p>
         </w:tc>
@@ -3048,7 +3048,7 @@
                 <w:sz w:val="17"/>
                 <w:szCs w:val="17"/>
               </w:rPr>
-              <w:t xml:space="preserve">05:25 - 05:27</w:t>
+              <w:t xml:space="preserve">05:41 - 05:43</w:t>
             </w:r>
           </w:p>
         </w:tc>
@@ -3157,7 +3157,7 @@
                 <w:sz w:val="17"/>
                 <w:szCs w:val="17"/>
               </w:rPr>
-              <w:t xml:space="preserve">05:27 - 06:23</w:t>
+              <w:t xml:space="preserve">05:43 - 06:40</w:t>
             </w:r>
           </w:p>
         </w:tc>
@@ -3266,7 +3266,7 @@
                 <w:sz w:val="17"/>
                 <w:szCs w:val="17"/>
               </w:rPr>
-              <w:t xml:space="preserve">06:23 - 06:38</w:t>
+              <w:t xml:space="preserve">06:40 - 06:55</w:t>
             </w:r>
           </w:p>
         </w:tc>
@@ -3375,7 +3375,7 @@
                 <w:sz w:val="17"/>
                 <w:szCs w:val="17"/>
               </w:rPr>
-              <w:t xml:space="preserve">06:38</w:t>
+              <w:t xml:space="preserve">06:55</w:t>
             </w:r>
           </w:p>
         </w:tc>
@@ -3484,7 +3484,7 @@
                 <w:sz w:val="17"/>
                 <w:szCs w:val="17"/>
               </w:rPr>
-              <w:t xml:space="preserve">06:38 - 06:56</w:t>
+              <w:t xml:space="preserve">06:55 - 07:13</w:t>
             </w:r>
           </w:p>
         </w:tc>
@@ -3593,7 +3593,7 @@
                 <w:sz w:val="17"/>
                 <w:szCs w:val="17"/>
               </w:rPr>
-              <w:t xml:space="preserve">06:56 - 07:04</w:t>
+              <w:t xml:space="preserve">07:13 - 07:21</w:t>
             </w:r>
           </w:p>
         </w:tc>

</xml_diff>

<commit_message>
Podcast: agregar nombres de las voces invitadas en créditos e imagen final
Co-Authored-By: Claude Opus 5.5 <noreply@anthropic.com>
Claude-Session: https://claude.ai/code/session_01XuLJcNgUM3tZLL1ekwQRQZ
</commit_message>
<xml_diff>
--- a/Actividades/Podcast_Mirada_sobre_la_prevencion_guion.docx
+++ b/Actividades/Podcast_Mirada_sobre_la_prevencion_guion.docx
@@ -1190,7 +1190,7 @@
           <w:sz w:val="22"/>
           <w:szCs w:val="22"/>
         </w:rPr>
-        <w:t xml:space="preserve">07:21 minutos.</w:t>
+        <w:t xml:space="preserve">07:22 minutos.</w:t>
       </w:r>
     </w:p>
     <w:p>
@@ -3484,7 +3484,7 @@
                 <w:sz w:val="17"/>
                 <w:szCs w:val="17"/>
               </w:rPr>
-              <w:t xml:space="preserve">06:55 - 07:13</w:t>
+              <w:t xml:space="preserve">06:55 - 07:14</w:t>
             </w:r>
           </w:p>
         </w:tc>
@@ -3552,7 +3552,7 @@
                 <w:sz w:val="17"/>
                 <w:szCs w:val="17"/>
               </w:rPr>
-              <w:t xml:space="preserve">Créditos. Guion, voz y producción: Yina Vanessa Cadena Mantilla. Voz invitada: [nombre]. Música y efectos: producción propia. Fuentes: Ministerio de Salud y Protección Social, Alcaldía de Barrancabermeja, Organización Mundial de la Salud y norma ISO 31000. Corporación Universitaria Minuto de Dios. ¡Gracias por escucharnos!</w:t>
+              <w:t xml:space="preserve">Créditos. Guion, voz y producción: Yina Vanessa Cadena Mantilla. Voces invitadas: Natalia Rojas y Alberto Pérez. Música y efectos: producción propia. Fuentes: Ministerio de Salud y Protección Social, Alcaldía de Barrancabermeja, Organización Mundial de la Salud y norma ISO 31000. Corporación Universitaria Minuto de Dios. ¡Gracias por escucharnos!</w:t>
             </w:r>
           </w:p>
         </w:tc>
@@ -3593,7 +3593,7 @@
                 <w:sz w:val="17"/>
                 <w:szCs w:val="17"/>
               </w:rPr>
-              <w:t xml:space="preserve">07:13 - 07:21</w:t>
+              <w:t xml:space="preserve">07:14 - 07:22</w:t>
             </w:r>
           </w:p>
         </w:tc>
@@ -3858,15 +3858,15 @@
           <w:sz w:val="22"/>
           <w:szCs w:val="22"/>
         </w:rPr>
-        <w:t xml:space="preserve">Voz invitada: </w:t>
-      </w:r>
-      <w:r>
-        <w:rPr>
-          <w:rFonts w:ascii="Arial" w:cs="Arial" w:eastAsia="Arial" w:hAnsi="Arial"/>
-          <w:sz w:val="22"/>
-          <w:szCs w:val="22"/>
-        </w:rPr>
-        <w:t xml:space="preserve">[nombre de la persona].</w:t>
+        <w:t xml:space="preserve">Voces invitadas: </w:t>
+      </w:r>
+      <w:r>
+        <w:rPr>
+          <w:rFonts w:ascii="Arial" w:cs="Arial" w:eastAsia="Arial" w:hAnsi="Arial"/>
+          <w:sz w:val="22"/>
+          <w:szCs w:val="22"/>
+        </w:rPr>
+        <w:t xml:space="preserve">Natalia Rojas y Alberto Pérez.</w:t>
       </w:r>
     </w:p>
     <w:p>

</xml_diff>